<commit_message>
Inserción de tipo de documento en generación de documentos
</commit_message>
<xml_diff>
--- a/data/modelos/cotizacion_admin.docx
+++ b/data/modelos/cotizacion_admin.docx
@@ -15,6 +15,7 @@
           <w:lang w:eastAsia="es-PE"/>
         </w:rPr>
       </w:pPr>
+      <w:proofErr w:type="spellStart"/>
       <w:r>
         <w:rPr>
           <w:rFonts w:ascii="Garamond" w:eastAsia="Times New Roman" w:hAnsi="Garamond" w:cs="Adobe Devanagari"/>
@@ -27,6 +28,7 @@
         </w:rPr>
         <w:t>nombre_docente</w:t>
       </w:r>
+      <w:proofErr w:type="spellEnd"/>
     </w:p>
     <w:p>
       <w:pPr>
@@ -41,6 +43,7 @@
           <w:lang w:eastAsia="es-PE"/>
         </w:rPr>
       </w:pPr>
+      <w:proofErr w:type="spellStart"/>
       <w:r>
         <w:rPr>
           <w:rFonts w:ascii="Garamond" w:eastAsia="Times New Roman" w:hAnsi="Garamond" w:cs="Adobe Devanagari"/>
@@ -89,6 +92,7 @@
         </w:rPr>
         <w:t>_cot</w:t>
       </w:r>
+      <w:proofErr w:type="spellEnd"/>
     </w:p>
     <w:p>
       <w:pPr>
@@ -106,6 +110,7 @@
           <w:lang w:eastAsia="es-PE"/>
         </w:rPr>
       </w:pPr>
+      <w:proofErr w:type="spellStart"/>
       <w:r>
         <w:rPr>
           <w:rFonts w:ascii="Garamond" w:eastAsia="Times New Roman" w:hAnsi="Garamond" w:cs="Adobe Devanagari"/>
@@ -118,6 +123,7 @@
         </w:rPr>
         <w:t>ruc_docente_cot</w:t>
       </w:r>
+      <w:proofErr w:type="spellEnd"/>
     </w:p>
     <w:p>
       <w:pPr>
@@ -131,6 +137,7 @@
           <w:szCs w:val="24"/>
         </w:rPr>
       </w:pPr>
+      <w:proofErr w:type="spellStart"/>
       <w:r>
         <w:rPr>
           <w:rFonts w:ascii="Garamond" w:hAnsi="Garamond"/>
@@ -141,6 +148,7 @@
         </w:rPr>
         <w:t>correo_docente_cot</w:t>
       </w:r>
+      <w:proofErr w:type="spellEnd"/>
     </w:p>
     <w:p>
       <w:pPr>
@@ -156,6 +164,7 @@
           <w:szCs w:val="24"/>
         </w:rPr>
       </w:pPr>
+      <w:proofErr w:type="spellStart"/>
       <w:r>
         <w:rPr>
           <w:rFonts w:ascii="Garamond" w:eastAsia="Times New Roman" w:hAnsi="Garamond" w:cs="Adobe Devanagari"/>
@@ -180,6 +189,7 @@
         </w:rPr>
         <w:t>_cot</w:t>
       </w:r>
+      <w:proofErr w:type="spellEnd"/>
     </w:p>
     <w:p>
       <w:pPr>
@@ -288,7 +298,7 @@
           <w:szCs w:val="24"/>
           <w:lang w:val="es-ES" w:eastAsia="es-ES"/>
         </w:rPr>
-        <w:t>29 de mayo de 2026</w:t>
+        <w:t>30 de mayo de 2026</w:t>
       </w:r>
       <w:r>
         <w:rPr>
@@ -490,6 +500,7 @@
         </w:rPr>
         <w:t xml:space="preserve">A su solicitud, presento la cotización para el </w:t>
       </w:r>
+      <w:proofErr w:type="spellStart"/>
       <w:r>
         <w:rPr>
           <w:rFonts w:ascii="Garamond" w:eastAsia="Times New Roman" w:hAnsi="Garamond" w:cs="Adobe Devanagari"/>
@@ -502,6 +513,7 @@
         </w:rPr>
         <w:t>descripcion_servicio</w:t>
       </w:r>
+      <w:proofErr w:type="spellEnd"/>
       <w:r>
         <w:rPr>
           <w:rFonts w:ascii="Garamond" w:eastAsia="Times New Roman" w:hAnsi="Garamond" w:cs="Adobe Devanagari"/>
@@ -540,17 +552,7 @@
           <w:szCs w:val="24"/>
           <w:lang w:eastAsia="es-PE"/>
         </w:rPr>
-        <w:t xml:space="preserve"> </w:t>
-      </w:r>
-      <w:r>
-        <w:rPr>
-          <w:rFonts w:ascii="Garamond" w:eastAsia="Times New Roman" w:hAnsi="Garamond" w:cs="Adobe Devanagari"/>
-          <w:color w:val="000000"/>
-          <w:sz w:val="24"/>
-          <w:szCs w:val="24"/>
-          <w:lang w:eastAsia="es-PE"/>
-        </w:rPr>
-        <w:t>bajo la modalidad presencial</w:t>
+        <w:t xml:space="preserve"> bajo la modalidad presencial</w:t>
       </w:r>
       <w:r>
         <w:rPr>
@@ -574,6 +576,7 @@
           <w:szCs w:val="24"/>
         </w:rPr>
       </w:pPr>
+      <w:proofErr w:type="spellStart"/>
       <w:r>
         <w:rPr>
           <w:rFonts w:ascii="Garamond" w:eastAsia="Times New Roman" w:hAnsi="Garamond" w:cs="Adobe Devanagari"/>
@@ -592,6 +595,7 @@
         </w:rPr>
         <w:t>ctividades_admin</w:t>
       </w:r>
+      <w:proofErr w:type="spellEnd"/>
     </w:p>
     <w:p>
       <w:pPr>
@@ -626,6 +630,7 @@
         </w:rPr>
         <w:t xml:space="preserve"> </w:t>
       </w:r>
+      <w:proofErr w:type="spellStart"/>
       <w:r>
         <w:rPr>
           <w:rFonts w:ascii="Garamond" w:hAnsi="Garamond"/>
@@ -636,6 +641,7 @@
         </w:rPr>
         <w:t>monto_subtotal</w:t>
       </w:r>
+      <w:proofErr w:type="spellEnd"/>
     </w:p>
     <w:p>
       <w:pPr>
@@ -736,6 +742,7 @@
           <w:lang w:val="pt-BR" w:eastAsia="es-PE"/>
         </w:rPr>
       </w:pPr>
+      <w:proofErr w:type="spellStart"/>
       <w:r>
         <w:rPr>
           <w:rFonts w:ascii="Garamond" w:eastAsia="Times New Roman" w:hAnsi="Garamond" w:cs="Adobe Devanagari"/>
@@ -760,6 +767,7 @@
         </w:rPr>
         <w:t>irma_docente</w:t>
       </w:r>
+      <w:proofErr w:type="spellEnd"/>
     </w:p>
     <w:p>
       <w:pPr>
@@ -774,6 +782,7 @@
           <w:lang w:val="pt-BR" w:eastAsia="es-PE"/>
         </w:rPr>
       </w:pPr>
+      <w:proofErr w:type="spellStart"/>
       <w:r>
         <w:rPr>
           <w:rFonts w:ascii="Garamond" w:eastAsia="Times New Roman" w:hAnsi="Garamond" w:cs="Adobe Devanagari"/>
@@ -786,6 +795,7 @@
         </w:rPr>
         <w:t>nombre_docente</w:t>
       </w:r>
+      <w:proofErr w:type="spellEnd"/>
     </w:p>
     <w:p>
       <w:pPr>
@@ -800,6 +810,7 @@
           <w:lang w:val="pt-BR"/>
         </w:rPr>
       </w:pPr>
+      <w:proofErr w:type="spellStart"/>
       <w:r>
         <w:rPr>
           <w:rFonts w:ascii="Garamond" w:eastAsia="Times New Roman" w:hAnsi="Garamond" w:cs="Adobe Devanagari"/>
@@ -810,6 +821,32 @@
           <w:szCs w:val="24"/>
           <w:lang w:val="pt-BR" w:eastAsia="es-PE"/>
         </w:rPr>
+        <w:t>tipo_documento</w:t>
+      </w:r>
+      <w:proofErr w:type="spellEnd"/>
+      <w:r>
+        <w:rPr>
+          <w:rFonts w:ascii="Garamond" w:eastAsia="Times New Roman" w:hAnsi="Garamond" w:cs="Adobe Devanagari"/>
+          <w:b/>
+          <w:bCs/>
+          <w:color w:val="000000"/>
+          <w:sz w:val="24"/>
+          <w:szCs w:val="24"/>
+          <w:lang w:val="pt-BR" w:eastAsia="es-PE"/>
+        </w:rPr>
+        <w:t xml:space="preserve">: </w:t>
+      </w:r>
+      <w:proofErr w:type="spellStart"/>
+      <w:r>
+        <w:rPr>
+          <w:rFonts w:ascii="Garamond" w:eastAsia="Times New Roman" w:hAnsi="Garamond" w:cs="Adobe Devanagari"/>
+          <w:b/>
+          <w:bCs/>
+          <w:color w:val="000000"/>
+          <w:sz w:val="24"/>
+          <w:szCs w:val="24"/>
+          <w:lang w:val="pt-BR" w:eastAsia="es-PE"/>
+        </w:rPr>
         <w:t>d</w:t>
       </w:r>
       <w:r>
@@ -836,6 +873,7 @@
         </w:rPr>
         <w:t>_cot</w:t>
       </w:r>
+      <w:proofErr w:type="spellEnd"/>
     </w:p>
     <w:sectPr>
       <w:pgSz w:w="12240" w:h="15840"/>

</xml_diff>